<commit_message>
docs: cerrar el backlog con RF-13, RF-14 y los 7 RNF (Etapas 5-10)
Completa el grilling de los 21 requisitos comprometidos ante el docente.
RF-13 y RF-14 quedan redactados con criterios de aceptacion en el backlog
renombrado (RF-01..14); los RNF-01..07 quedan en un documento nuevo con
criterio + instrumento cada uno.

Se corrigen tres contradicciones reales encontradas entre el .docx de la
Actividad 3 v3 y el CLAUDE.md del proyecto: RNF-01 seguia en p95<5s pese a
que el CLAUDE.md ya declaraba 8s desde el 26-ago; RNF-02 asumia un servidor
24/7 que el propio CLAUDE.md dice que no existe; RNF-03 no tenia numero ni
instrumento. Se decide y documenta el despliegue real (frontend en Vercel,
backend en Render, tier gratis) y se reescribe RNF-02 sobre esa base.

Genera un resumen HTML para que Angelica revise lo decidido en su ausencia
antes de darlo por definitivo.

Co-Authored-By: Claude Sonnet 5 <noreply@anthropic.com>
</commit_message>
<xml_diff>
--- a/docs/actividad3/actividad 3 ing soft_APA v3.docx
+++ b/docs/actividad3/actividad 3 ing soft_APA v3.docx
@@ -171,6 +171,16 @@
           <w:sz w:val="20"/>
         </w:rPr>
         <w:t>Revisión v3 (2026-08-24): Se aplicaron las decisiones del grill interno del equipo sobre los requisitos y las métricas. Cambios principales: RF-10 pasa a destino favorito, RF-12 añade notificación a usuarios relevantes, RF-13 lista 5 métricas, RNF-01 sube el tiempo a p95 &lt; 5 s y añade modo offline básico (solo ruta, sin tiempo de llegada), RNF-02 baja a 95% mensual, RNF-04 aclara que el login es 1 vez/semana, RNF-05 se reduce a herramientas en CI, RNF-06 explicita bcrypt, RNF-07 amplía a Chrome + Safari + escritorio, RNF-08 se elimina, y la tabla de métricas queda con 5 indicadores (uno por atributo ISO 25010), eliminando las 3 métricas propias.</w:t>
+      </w:r>
+    </w:p>
+    <w:p>
+      <w:r>
+        <w:rPr>
+          <w:b/>
+          <w:color w:val="555555"/>
+          <w:sz w:val="20"/>
+        </w:rPr>
+        <w:t>Revisión v3.1 (2026-09-14): grill de continuación sobre RF-13, RF-14 y RNF-01..07 (backlog completo en docs/backlog/). Se corrige RNF-01 a p95 &lt; 8 s (el .docx seguía en 5 s pese a que el CLAUDE.md ya declaraba 8 s desde el 26-ago; la tabla de métricas tenía el mismo desfase). Se reescribe RNF-02 sobre el despliegue real decidido esta sesión: frontend en Vercel, backend en Render (tier gratis, con cold start de hasta 60 s tras inactividad — no un servidor 24/7 clásico). Se añade número e instrumento a RNF-03 (0 violaciones hexagonales en CI + ≥70% cobertura en domain/, vía ArchUnit + JaCoCo), que antes no tenía ninguno de los dos.</w:t>
       </w:r>
     </w:p>
     <w:p>
@@ -1747,7 +1757,7 @@
               <w:rPr>
                 <w:sz w:val="20"/>
               </w:rPr>
-              <w:t>El sistema debe responder las consultas de ruta con un p95 menor a 5 segundos medido extremo a extremo (cliente → API → render) en una red 4G típica, verificado con Spring Boot Actuator + Micrometer. La aplicación ofrece un modo offline básico que muestra la ruta sugerida y los barrios por los que pasa, sin incluir el cálculo de tiempo de llegada, el cual sí se obtiene en línea vía la API externa de geocodificación.</w:t>
+              <w:t>El sistema debe responder las consultas de ruta con un p95 menor a 8 segundos medido extremo a extremo (cliente → backend → Google Maps → render) en una red 4G típica, verificado con Spring Boot Actuator + Micrometer. Se cachean los tiempos de viaje por par origen-destino con un TTL de 5 minutos para no exceder ese límite. La aplicación ofrece un modo offline básico que muestra la ruta sugerida y los barrios por los que pasa (calculada por distancia geométrica sobre el trazado GeoJSON), sin incluir el cálculo de tiempo de llegada, el cual solo se obtiene en línea vía Google Maps.</w:t>
             </w:r>
           </w:p>
         </w:tc>
@@ -1790,7 +1800,7 @@
               <w:rPr>
                 <w:sz w:val="20"/>
               </w:rPr>
-              <w:t>El sistema debe mantener al menos un 95% de disponibilidad mensual del backend, medida con UptimeRobot (latido cada 5 minutos), en horario hábil de lunes a viernes entre 7:00 y 21:00 hora Colombia. RTO &lt; 1 hora lectiva y RPO &lt; 24 horas, con backup diario automatizado de PostgreSQL.</w:t>
+              <w:t>El backend se despliega en Render (tier gratis) y el frontend en Vercel. El tier gratis de Render suspende el servicio tras 15 minutos sin tráfico y tarda entre 30 y 60 segundos en reactivarse ante la siguiente petición (cold start); esa reactivación no cuenta como caída para efectos de esta métrica. Medido con UptimeRobot (latido cada 5 minutos) en horario hábil de lunes a viernes entre 7:00 y 21:00 hora Colombia, el sistema debe responder correctamente (incluyendo el tiempo de cold start) en al menos un 95% de los latidos registrados. RPO &lt; 24 horas con backup diario automatizado de PostgreSQL (Supabase). No se compromete un RTO de servidor siempre activo, porque el tier gratis no lo sostiene.</w:t>
             </w:r>
           </w:p>
         </w:tc>
@@ -1832,9 +1842,9 @@
             </w:pPr>
             <w:r>
               <w:rPr>
-                <w:lang w:val="es-CO"/>
+                <w:sz w:val="20"/>
               </w:rPr>
-              <w:t>El backend debe mantener una separación estricta entre las capas del hexágono (dominio, aplicación, adaptadores), sin que la lógica de negocio dependa directamente de frameworks externos.</w:t>
+              <w:t>El backend debe mantener una separación estricta entre las capas del hexágono (dominio, aplicación, adaptadores), sin que la lógica de negocio dependa directamente de frameworks externos: 0 violaciones de la arquitectura hexagonal detectadas por ArchUnit en CI, y al menos 70% de cobertura de tests unitarios en el paquete domain/, medida con JaCoCo.</w:t>
             </w:r>
           </w:p>
         </w:tc>
@@ -2126,7 +2136,7 @@
               <w:rPr>
                 <w:sz w:val="20"/>
               </w:rPr>
-              <w:t>p95 &lt; 5 s en /api/routes/search (medido extremo a extremo) + LCP &lt; 2.5 s en Lighthouse mobile con throttling 'Slow 4G'</w:t>
+              <w:t>p95 &lt; 8 s en /api/routes/search (medido extremo a extremo, cliente → backend → Google Maps → render) + LCP &lt; 2.5 s en Lighthouse mobile con throttling 'Slow 4G'. Caché de 5 min por par origen-destino.</w:t>
             </w:r>
           </w:p>
         </w:tc>
@@ -2175,7 +2185,7 @@
               <w:rPr>
                 <w:sz w:val="20"/>
               </w:rPr>
-              <w:t>≥ 95% de uptime mensual del backend en horario hábil (lun–vie 7:00–21:00), con RTO &lt; 1 hora lectiva y RPO &lt; 24 horas</w:t>
+              <w:t>≥ 95% de los latidos de monitoreo responden correctamente en horario hábil (lun–vie 7:00–21:00), incluyendo el cold start del tier gratis de Render (hasta 60 s tras 15 min de inactividad); RPO &lt; 24 horas.</w:t>
             </w:r>
           </w:p>
         </w:tc>
@@ -2193,7 +2203,7 @@
               <w:rPr>
                 <w:sz w:val="20"/>
               </w:rPr>
-              <w:t>UptimeRobot (latido cada 5 minutos) + backup diario automatizado de PostgreSQL y restore probado al cierre de cada sprint.</w:t>
+              <w:t>UptimeRobot (latido cada 5 minutos) contra el backend en Render + backup diario automatizado de PostgreSQL (Supabase) y restore probado al cierre de cada sprint.</w:t>
             </w:r>
           </w:p>
         </w:tc>

</xml_diff>